<commit_message>
docs: drop references to removed slide and gap files
</commit_message>
<xml_diff>
--- a/FINAL_REPORT.docx
+++ b/FINAL_REPORT.docx
@@ -11256,21 +11256,6 @@
         <w:rPr>
           <w:rStyle w:val="VerbatimChar"/>
         </w:rPr>
-        <w:t xml:space="preserve">docs/GAPS.md</w:t>
-      </w:r>
-      <w:r>
-        <w:t xml:space="preserve"> </w:t>
-      </w:r>
-      <w:r>
-        <w:t xml:space="preserve">(initial gap analysis),</w:t>
-      </w:r>
-      <w:r>
-        <w:t xml:space="preserve"> </w:t>
-      </w:r>
-      <w:r>
-        <w:rPr>
-          <w:rStyle w:val="VerbatimChar"/>
-        </w:rPr>
         <w:t xml:space="preserve">docs/FINETUNE.md</w:t>
       </w:r>
       <w:r>
@@ -11286,28 +11271,13 @@
         <w:rPr>
           <w:rStyle w:val="VerbatimChar"/>
         </w:rPr>
-        <w:t xml:space="preserve">docs/SLIDES.md</w:t>
-      </w:r>
-      <w:r>
-        <w:t xml:space="preserve"> </w:t>
-      </w:r>
-      <w:r>
-        <w:t xml:space="preserve">and</w:t>
-      </w:r>
-      <w:r>
-        <w:t xml:space="preserve"> </w:t>
-      </w:r>
-      <w:r>
-        <w:rPr>
-          <w:rStyle w:val="VerbatimChar"/>
-        </w:rPr>
-        <w:t xml:space="preserve">docs/SCRIPT.md</w:t>
-      </w:r>
-      <w:r>
-        <w:t xml:space="preserve"> </w:t>
-      </w:r>
-      <w:r>
-        <w:t xml:space="preserve">(presentation).</w:t>
+        <w:t xml:space="preserve">docs/DEMO_SCRIPT.md</w:t>
+      </w:r>
+      <w:r>
+        <w:t xml:space="preserve"> </w:t>
+      </w:r>
+      <w:r>
+        <w:t xml:space="preserve">(the demo walkthrough).</w:t>
       </w:r>
     </w:p>
     <w:p>

</xml_diff>

<commit_message>
docs: appendix D gets the full schema and sample validated/rejected outputs
</commit_message>
<xml_diff>
--- a/FINAL_REPORT.docx
+++ b/FINAL_REPORT.docx
@@ -14606,6 +14606,902 @@
       </w:r>
       <w:r>
         <w:t xml:space="preserve">, and so on). A different customer message gets different examples with no change to the code.</w:t>
+      </w:r>
+    </w:p>
+    <w:p>
+      <w:pPr>
+        <w:pStyle w:val="BodyText"/>
+      </w:pPr>
+      <w:r>
+        <w:rPr>
+          <w:b/>
+          <w:bCs/>
+        </w:rPr>
+        <w:t xml:space="preserve">The structured-output schema and sample outputs (Section 10)</w:t>
+      </w:r>
+    </w:p>
+    <w:p>
+      <w:pPr>
+        <w:pStyle w:val="BodyText"/>
+      </w:pPr>
+      <w:r>
+        <w:t xml:space="preserve">The schema as built at start-up in</w:t>
+      </w:r>
+      <w:r>
+        <w:t xml:space="preserve"> </w:t>
+      </w:r>
+      <w:r>
+        <w:rPr>
+          <w:rStyle w:val="VerbatimChar"/>
+        </w:rPr>
+        <w:t xml:space="preserve">src/structured.py</w:t>
+      </w:r>
+      <w:r>
+        <w:t xml:space="preserve">. The</w:t>
+      </w:r>
+      <w:r>
+        <w:t xml:space="preserve"> </w:t>
+      </w:r>
+      <w:r>
+        <w:rPr>
+          <w:rStyle w:val="VerbatimChar"/>
+        </w:rPr>
+        <w:t xml:space="preserve">enum</w:t>
+      </w:r>
+      <w:r>
+        <w:t xml:space="preserve"> </w:t>
+      </w:r>
+      <w:r>
+        <w:t xml:space="preserve">holds all 77 intent names, read from</w:t>
+      </w:r>
+      <w:r>
+        <w:t xml:space="preserve"> </w:t>
+      </w:r>
+      <w:r>
+        <w:rPr>
+          <w:rStyle w:val="VerbatimChar"/>
+        </w:rPr>
+        <w:t xml:space="preserve">data/train.csv</w:t>
+      </w:r>
+      <w:r>
+        <w:t xml:space="preserve">:</w:t>
+      </w:r>
+    </w:p>
+    <w:p>
+      <w:pPr>
+        <w:pStyle w:val="SourceCode"/>
+      </w:pPr>
+      <w:r>
+        <w:rPr>
+          <w:rStyle w:val="FunctionTok"/>
+        </w:rPr>
+        <w:t xml:space="preserve">{</w:t>
+      </w:r>
+      <w:r>
+        <w:br/>
+      </w:r>
+      <w:r>
+        <w:rPr>
+          <w:rStyle w:val="NormalTok"/>
+        </w:rPr>
+        <w:t xml:space="preserve">  </w:t>
+      </w:r>
+      <w:r>
+        <w:rPr>
+          <w:rStyle w:val="DataTypeTok"/>
+        </w:rPr>
+        <w:t xml:space="preserve">"type"</w:t>
+      </w:r>
+      <w:r>
+        <w:rPr>
+          <w:rStyle w:val="FunctionTok"/>
+        </w:rPr>
+        <w:t xml:space="preserve">:</w:t>
+      </w:r>
+      <w:r>
+        <w:rPr>
+          <w:rStyle w:val="NormalTok"/>
+        </w:rPr>
+        <w:t xml:space="preserve"> </w:t>
+      </w:r>
+      <w:r>
+        <w:rPr>
+          <w:rStyle w:val="StringTok"/>
+        </w:rPr>
+        <w:t xml:space="preserve">"object"</w:t>
+      </w:r>
+      <w:r>
+        <w:rPr>
+          <w:rStyle w:val="FunctionTok"/>
+        </w:rPr>
+        <w:t xml:space="preserve">,</w:t>
+      </w:r>
+      <w:r>
+        <w:br/>
+      </w:r>
+      <w:r>
+        <w:rPr>
+          <w:rStyle w:val="NormalTok"/>
+        </w:rPr>
+        <w:t xml:space="preserve">  </w:t>
+      </w:r>
+      <w:r>
+        <w:rPr>
+          <w:rStyle w:val="DataTypeTok"/>
+        </w:rPr>
+        <w:t xml:space="preserve">"properties"</w:t>
+      </w:r>
+      <w:r>
+        <w:rPr>
+          <w:rStyle w:val="FunctionTok"/>
+        </w:rPr>
+        <w:t xml:space="preserve">:</w:t>
+      </w:r>
+      <w:r>
+        <w:rPr>
+          <w:rStyle w:val="NormalTok"/>
+        </w:rPr>
+        <w:t xml:space="preserve"> </w:t>
+      </w:r>
+      <w:r>
+        <w:rPr>
+          <w:rStyle w:val="FunctionTok"/>
+        </w:rPr>
+        <w:t xml:space="preserve">{</w:t>
+      </w:r>
+      <w:r>
+        <w:br/>
+      </w:r>
+      <w:r>
+        <w:rPr>
+          <w:rStyle w:val="NormalTok"/>
+        </w:rPr>
+        <w:t xml:space="preserve">    </w:t>
+      </w:r>
+      <w:r>
+        <w:rPr>
+          <w:rStyle w:val="DataTypeTok"/>
+        </w:rPr>
+        <w:t xml:space="preserve">"intent"</w:t>
+      </w:r>
+      <w:r>
+        <w:rPr>
+          <w:rStyle w:val="FunctionTok"/>
+        </w:rPr>
+        <w:t xml:space="preserve">:</w:t>
+      </w:r>
+      <w:r>
+        <w:rPr>
+          <w:rStyle w:val="NormalTok"/>
+        </w:rPr>
+        <w:t xml:space="preserve">     </w:t>
+      </w:r>
+      <w:r>
+        <w:rPr>
+          <w:rStyle w:val="FunctionTok"/>
+        </w:rPr>
+        <w:t xml:space="preserve">{</w:t>
+      </w:r>
+      <w:r>
+        <w:rPr>
+          <w:rStyle w:val="DataTypeTok"/>
+        </w:rPr>
+        <w:t xml:space="preserve">"type"</w:t>
+      </w:r>
+      <w:r>
+        <w:rPr>
+          <w:rStyle w:val="FunctionTok"/>
+        </w:rPr>
+        <w:t xml:space="preserve">:</w:t>
+      </w:r>
+      <w:r>
+        <w:rPr>
+          <w:rStyle w:val="NormalTok"/>
+        </w:rPr>
+        <w:t xml:space="preserve"> </w:t>
+      </w:r>
+      <w:r>
+        <w:rPr>
+          <w:rStyle w:val="StringTok"/>
+        </w:rPr>
+        <w:t xml:space="preserve">"string"</w:t>
+      </w:r>
+      <w:r>
+        <w:rPr>
+          <w:rStyle w:val="FunctionTok"/>
+        </w:rPr>
+        <w:t xml:space="preserve">,</w:t>
+      </w:r>
+      <w:r>
+        <w:br/>
+      </w:r>
+      <w:r>
+        <w:rPr>
+          <w:rStyle w:val="NormalTok"/>
+        </w:rPr>
+        <w:t xml:space="preserve">                   </w:t>
+      </w:r>
+      <w:r>
+        <w:rPr>
+          <w:rStyle w:val="DataTypeTok"/>
+        </w:rPr>
+        <w:t xml:space="preserve">"enum"</w:t>
+      </w:r>
+      <w:r>
+        <w:rPr>
+          <w:rStyle w:val="FunctionTok"/>
+        </w:rPr>
+        <w:t xml:space="preserve">:</w:t>
+      </w:r>
+      <w:r>
+        <w:rPr>
+          <w:rStyle w:val="NormalTok"/>
+        </w:rPr>
+        <w:t xml:space="preserve"> </w:t>
+      </w:r>
+      <w:r>
+        <w:rPr>
+          <w:rStyle w:val="OtherTok"/>
+        </w:rPr>
+        <w:t xml:space="preserve">[</w:t>
+      </w:r>
+      <w:r>
+        <w:rPr>
+          <w:rStyle w:val="StringTok"/>
+        </w:rPr>
+        <w:t xml:space="preserve">"Refund_not_showing_up"</w:t>
+      </w:r>
+      <w:r>
+        <w:rPr>
+          <w:rStyle w:val="OtherTok"/>
+        </w:rPr>
+        <w:t xml:space="preserve">,</w:t>
+      </w:r>
+      <w:r>
+        <w:rPr>
+          <w:rStyle w:val="NormalTok"/>
+        </w:rPr>
+        <w:t xml:space="preserve"> </w:t>
+      </w:r>
+      <w:r>
+        <w:rPr>
+          <w:rStyle w:val="StringTok"/>
+        </w:rPr>
+        <w:t xml:space="preserve">"activate_my_card"</w:t>
+      </w:r>
+      <w:r>
+        <w:rPr>
+          <w:rStyle w:val="OtherTok"/>
+        </w:rPr>
+        <w:t xml:space="preserve">,</w:t>
+      </w:r>
+      <w:r>
+        <w:rPr>
+          <w:rStyle w:val="NormalTok"/>
+        </w:rPr>
+        <w:t xml:space="preserve"> </w:t>
+      </w:r>
+      <w:r>
+        <w:rPr>
+          <w:rStyle w:val="StringTok"/>
+        </w:rPr>
+        <w:t xml:space="preserve">"age_limit"</w:t>
+      </w:r>
+      <w:r>
+        <w:rPr>
+          <w:rStyle w:val="OtherTok"/>
+        </w:rPr>
+        <w:t xml:space="preserve">,</w:t>
+      </w:r>
+      <w:r>
+        <w:br/>
+      </w:r>
+      <w:r>
+        <w:rPr>
+          <w:rStyle w:val="NormalTok"/>
+        </w:rPr>
+        <w:t xml:space="preserve">                            </w:t>
+      </w:r>
+      <w:r>
+        <w:rPr>
+          <w:rStyle w:val="StringTok"/>
+        </w:rPr>
+        <w:t xml:space="preserve">"... (all 77 intent names) ..."</w:t>
+      </w:r>
+      <w:r>
+        <w:rPr>
+          <w:rStyle w:val="OtherTok"/>
+        </w:rPr>
+        <w:t xml:space="preserve">,</w:t>
+      </w:r>
+      <w:r>
+        <w:br/>
+      </w:r>
+      <w:r>
+        <w:rPr>
+          <w:rStyle w:val="NormalTok"/>
+        </w:rPr>
+        <w:t xml:space="preserve">                            </w:t>
+      </w:r>
+      <w:r>
+        <w:rPr>
+          <w:rStyle w:val="StringTok"/>
+        </w:rPr>
+        <w:t xml:space="preserve">"wrong_exchange_rate_for_cash_withdrawal"</w:t>
+      </w:r>
+      <w:r>
+        <w:rPr>
+          <w:rStyle w:val="OtherTok"/>
+        </w:rPr>
+        <w:t xml:space="preserve">]</w:t>
+      </w:r>
+      <w:r>
+        <w:rPr>
+          <w:rStyle w:val="FunctionTok"/>
+        </w:rPr>
+        <w:t xml:space="preserve">},</w:t>
+      </w:r>
+      <w:r>
+        <w:br/>
+      </w:r>
+      <w:r>
+        <w:rPr>
+          <w:rStyle w:val="NormalTok"/>
+        </w:rPr>
+        <w:t xml:space="preserve">    </w:t>
+      </w:r>
+      <w:r>
+        <w:rPr>
+          <w:rStyle w:val="DataTypeTok"/>
+        </w:rPr>
+        <w:t xml:space="preserve">"confidence"</w:t>
+      </w:r>
+      <w:r>
+        <w:rPr>
+          <w:rStyle w:val="FunctionTok"/>
+        </w:rPr>
+        <w:t xml:space="preserve">:</w:t>
+      </w:r>
+      <w:r>
+        <w:rPr>
+          <w:rStyle w:val="NormalTok"/>
+        </w:rPr>
+        <w:t xml:space="preserve"> </w:t>
+      </w:r>
+      <w:r>
+        <w:rPr>
+          <w:rStyle w:val="FunctionTok"/>
+        </w:rPr>
+        <w:t xml:space="preserve">{</w:t>
+      </w:r>
+      <w:r>
+        <w:rPr>
+          <w:rStyle w:val="DataTypeTok"/>
+        </w:rPr>
+        <w:t xml:space="preserve">"type"</w:t>
+      </w:r>
+      <w:r>
+        <w:rPr>
+          <w:rStyle w:val="FunctionTok"/>
+        </w:rPr>
+        <w:t xml:space="preserve">:</w:t>
+      </w:r>
+      <w:r>
+        <w:rPr>
+          <w:rStyle w:val="NormalTok"/>
+        </w:rPr>
+        <w:t xml:space="preserve"> </w:t>
+      </w:r>
+      <w:r>
+        <w:rPr>
+          <w:rStyle w:val="StringTok"/>
+        </w:rPr>
+        <w:t xml:space="preserve">"number"</w:t>
+      </w:r>
+      <w:r>
+        <w:rPr>
+          <w:rStyle w:val="FunctionTok"/>
+        </w:rPr>
+        <w:t xml:space="preserve">,</w:t>
+      </w:r>
+      <w:r>
+        <w:rPr>
+          <w:rStyle w:val="NormalTok"/>
+        </w:rPr>
+        <w:t xml:space="preserve"> </w:t>
+      </w:r>
+      <w:r>
+        <w:rPr>
+          <w:rStyle w:val="DataTypeTok"/>
+        </w:rPr>
+        <w:t xml:space="preserve">"minimum"</w:t>
+      </w:r>
+      <w:r>
+        <w:rPr>
+          <w:rStyle w:val="FunctionTok"/>
+        </w:rPr>
+        <w:t xml:space="preserve">:</w:t>
+      </w:r>
+      <w:r>
+        <w:rPr>
+          <w:rStyle w:val="NormalTok"/>
+        </w:rPr>
+        <w:t xml:space="preserve"> </w:t>
+      </w:r>
+      <w:r>
+        <w:rPr>
+          <w:rStyle w:val="DecValTok"/>
+        </w:rPr>
+        <w:t xml:space="preserve">0</w:t>
+      </w:r>
+      <w:r>
+        <w:rPr>
+          <w:rStyle w:val="FunctionTok"/>
+        </w:rPr>
+        <w:t xml:space="preserve">,</w:t>
+      </w:r>
+      <w:r>
+        <w:rPr>
+          <w:rStyle w:val="NormalTok"/>
+        </w:rPr>
+        <w:t xml:space="preserve"> </w:t>
+      </w:r>
+      <w:r>
+        <w:rPr>
+          <w:rStyle w:val="DataTypeTok"/>
+        </w:rPr>
+        <w:t xml:space="preserve">"maximum"</w:t>
+      </w:r>
+      <w:r>
+        <w:rPr>
+          <w:rStyle w:val="FunctionTok"/>
+        </w:rPr>
+        <w:t xml:space="preserve">:</w:t>
+      </w:r>
+      <w:r>
+        <w:rPr>
+          <w:rStyle w:val="NormalTok"/>
+        </w:rPr>
+        <w:t xml:space="preserve"> </w:t>
+      </w:r>
+      <w:r>
+        <w:rPr>
+          <w:rStyle w:val="DecValTok"/>
+        </w:rPr>
+        <w:t xml:space="preserve">1</w:t>
+      </w:r>
+      <w:r>
+        <w:rPr>
+          <w:rStyle w:val="FunctionTok"/>
+        </w:rPr>
+        <w:t xml:space="preserve">}</w:t>
+      </w:r>
+      <w:r>
+        <w:br/>
+      </w:r>
+      <w:r>
+        <w:rPr>
+          <w:rStyle w:val="NormalTok"/>
+        </w:rPr>
+        <w:t xml:space="preserve">  </w:t>
+      </w:r>
+      <w:r>
+        <w:rPr>
+          <w:rStyle w:val="FunctionTok"/>
+        </w:rPr>
+        <w:t xml:space="preserve">},</w:t>
+      </w:r>
+      <w:r>
+        <w:br/>
+      </w:r>
+      <w:r>
+        <w:rPr>
+          <w:rStyle w:val="NormalTok"/>
+        </w:rPr>
+        <w:t xml:space="preserve">  </w:t>
+      </w:r>
+      <w:r>
+        <w:rPr>
+          <w:rStyle w:val="DataTypeTok"/>
+        </w:rPr>
+        <w:t xml:space="preserve">"required"</w:t>
+      </w:r>
+      <w:r>
+        <w:rPr>
+          <w:rStyle w:val="FunctionTok"/>
+        </w:rPr>
+        <w:t xml:space="preserve">:</w:t>
+      </w:r>
+      <w:r>
+        <w:rPr>
+          <w:rStyle w:val="NormalTok"/>
+        </w:rPr>
+        <w:t xml:space="preserve"> </w:t>
+      </w:r>
+      <w:r>
+        <w:rPr>
+          <w:rStyle w:val="OtherTok"/>
+        </w:rPr>
+        <w:t xml:space="preserve">[</w:t>
+      </w:r>
+      <w:r>
+        <w:rPr>
+          <w:rStyle w:val="StringTok"/>
+        </w:rPr>
+        <w:t xml:space="preserve">"intent"</w:t>
+      </w:r>
+      <w:r>
+        <w:rPr>
+          <w:rStyle w:val="OtherTok"/>
+        </w:rPr>
+        <w:t xml:space="preserve">,</w:t>
+      </w:r>
+      <w:r>
+        <w:rPr>
+          <w:rStyle w:val="NormalTok"/>
+        </w:rPr>
+        <w:t xml:space="preserve"> </w:t>
+      </w:r>
+      <w:r>
+        <w:rPr>
+          <w:rStyle w:val="StringTok"/>
+        </w:rPr>
+        <w:t xml:space="preserve">"confidence"</w:t>
+      </w:r>
+      <w:r>
+        <w:rPr>
+          <w:rStyle w:val="OtherTok"/>
+        </w:rPr>
+        <w:t xml:space="preserve">]</w:t>
+      </w:r>
+      <w:r>
+        <w:rPr>
+          <w:rStyle w:val="FunctionTok"/>
+        </w:rPr>
+        <w:t xml:space="preserve">,</w:t>
+      </w:r>
+      <w:r>
+        <w:br/>
+      </w:r>
+      <w:r>
+        <w:rPr>
+          <w:rStyle w:val="NormalTok"/>
+        </w:rPr>
+        <w:t xml:space="preserve">  </w:t>
+      </w:r>
+      <w:r>
+        <w:rPr>
+          <w:rStyle w:val="DataTypeTok"/>
+        </w:rPr>
+        <w:t xml:space="preserve">"additionalProperties"</w:t>
+      </w:r>
+      <w:r>
+        <w:rPr>
+          <w:rStyle w:val="FunctionTok"/>
+        </w:rPr>
+        <w:t xml:space="preserve">:</w:t>
+      </w:r>
+      <w:r>
+        <w:rPr>
+          <w:rStyle w:val="NormalTok"/>
+        </w:rPr>
+        <w:t xml:space="preserve"> </w:t>
+      </w:r>
+      <w:r>
+        <w:rPr>
+          <w:rStyle w:val="KeywordTok"/>
+        </w:rPr>
+        <w:t xml:space="preserve">false</w:t>
+      </w:r>
+      <w:r>
+        <w:br/>
+      </w:r>
+      <w:r>
+        <w:rPr>
+          <w:rStyle w:val="FunctionTok"/>
+        </w:rPr>
+        <w:t xml:space="preserve">}</w:t>
+      </w:r>
+    </w:p>
+    <w:p>
+      <w:pPr>
+        <w:pStyle w:val="FirstParagraph"/>
+      </w:pPr>
+      <w:r>
+        <w:t xml:space="preserve">Sample outputs from the run, exactly as the model wrote them (</w:t>
+      </w:r>
+      <w:r>
+        <w:rPr>
+          <w:rStyle w:val="VerbatimChar"/>
+        </w:rPr>
+        <w:t xml:space="preserve">evaluation/results/results_structured.csv</w:t>
+      </w:r>
+      <w:r>
+        <w:t xml:space="preserve">):</w:t>
+      </w:r>
+    </w:p>
+    <w:tbl>
+      <w:tblPr>
+        <w:tblStyle w:val="Table"/>
+        <w:tblW w:type="auto" w:w="0"/>
+        <w:tblLook w:firstRow="1" w:lastRow="0" w:firstColumn="0" w:lastColumn="0" w:noHBand="0" w:noVBand="0" w:val="0020"/>
+      </w:tblPr>
+      <w:tblGrid>
+        <w:gridCol w:w="2640"/>
+        <w:gridCol w:w="2640"/>
+        <w:gridCol w:w="2640"/>
+      </w:tblGrid>
+      <w:tr>
+        <w:trPr>
+          <w:tblHeader w:val="on"/>
+        </w:trPr>
+        <w:tc>
+          <w:tcPr/>
+          <w:p>
+            <w:pPr>
+              <w:pStyle w:val="Compact"/>
+            </w:pPr>
+            <w:r>
+              <w:t xml:space="preserve">Customer message</w:t>
+            </w:r>
+          </w:p>
+        </w:tc>
+        <w:tc>
+          <w:tcPr/>
+          <w:p>
+            <w:pPr>
+              <w:pStyle w:val="Compact"/>
+            </w:pPr>
+            <w:r>
+              <w:t xml:space="preserve">Model output</w:t>
+            </w:r>
+          </w:p>
+        </w:tc>
+        <w:tc>
+          <w:tcPr/>
+          <w:p>
+            <w:pPr>
+              <w:pStyle w:val="Compact"/>
+            </w:pPr>
+            <w:r>
+              <w:t xml:space="preserve">Validator</w:t>
+            </w:r>
+          </w:p>
+        </w:tc>
+      </w:tr>
+      <w:tr>
+        <w:tc>
+          <w:tcPr/>
+          <w:p>
+            <w:pPr>
+              <w:pStyle w:val="Compact"/>
+            </w:pPr>
+            <w:r>
+              <w:t xml:space="preserve">How long should my new card take to arrive?</w:t>
+            </w:r>
+          </w:p>
+        </w:tc>
+        <w:tc>
+          <w:tcPr/>
+          <w:p>
+            <w:pPr>
+              <w:pStyle w:val="Compact"/>
+            </w:pPr>
+            <w:r>
+              <w:rPr>
+                <w:rStyle w:val="VerbatimChar"/>
+              </w:rPr>
+              <w:t xml:space="preserve">{"intent": "card_arrival", "confidence": 0.9}</w:t>
+            </w:r>
+          </w:p>
+        </w:tc>
+        <w:tc>
+          <w:tcPr/>
+          <w:p>
+            <w:pPr>
+              <w:pStyle w:val="Compact"/>
+            </w:pPr>
+            <w:r>
+              <w:t xml:space="preserve">valid, correct</w:t>
+            </w:r>
+          </w:p>
+        </w:tc>
+      </w:tr>
+      <w:tr>
+        <w:tc>
+          <w:tcPr/>
+          <w:p>
+            <w:pPr>
+              <w:pStyle w:val="Compact"/>
+            </w:pPr>
+            <w:r>
+              <w:t xml:space="preserve">What foreign exchange rate will you use?</w:t>
+            </w:r>
+          </w:p>
+        </w:tc>
+        <w:tc>
+          <w:tcPr/>
+          <w:p>
+            <w:pPr>
+              <w:pStyle w:val="Compact"/>
+            </w:pPr>
+            <w:r>
+              <w:rPr>
+                <w:rStyle w:val="VerbatimChar"/>
+              </w:rPr>
+              <w:t xml:space="preserve">```json {"intent": "exchange_rate", "confidence": 0.9} ```</w:t>
+            </w:r>
+          </w:p>
+        </w:tc>
+        <w:tc>
+          <w:tcPr/>
+          <w:p>
+            <w:pPr>
+              <w:pStyle w:val="Compact"/>
+            </w:pPr>
+            <w:r>
+              <w:t xml:space="preserve">valid after the fence is stripped, correct</w:t>
+            </w:r>
+          </w:p>
+        </w:tc>
+      </w:tr>
+      <w:tr>
+        <w:tc>
+          <w:tcPr/>
+          <w:p>
+            <w:pPr>
+              <w:pStyle w:val="Compact"/>
+            </w:pPr>
+            <w:r>
+              <w:t xml:space="preserve">How do I exchange currency?</w:t>
+            </w:r>
+          </w:p>
+        </w:tc>
+        <w:tc>
+          <w:tcPr/>
+          <w:p>
+            <w:pPr>
+              <w:pStyle w:val="Compact"/>
+            </w:pPr>
+            <w:r>
+              <w:rPr>
+                <w:rStyle w:val="VerbatimChar"/>
+              </w:rPr>
+              <w:t xml:space="preserve">{"intent": "exchange_currency", "confidence": 0.9}</w:t>
+            </w:r>
+          </w:p>
+        </w:tc>
+        <w:tc>
+          <w:tcPr/>
+          <w:p>
+            <w:pPr>
+              <w:pStyle w:val="Compact"/>
+            </w:pPr>
+            <w:r>
+              <w:rPr>
+                <w:b/>
+                <w:bCs/>
+              </w:rPr>
+              <w:t xml:space="preserve">rejected</w:t>
+            </w:r>
+            <w:r>
+              <w:t xml:space="preserve">:</w:t>
+            </w:r>
+            <w:r>
+              <w:t xml:space="preserve"> </w:t>
+            </w:r>
+            <w:r>
+              <w:rPr>
+                <w:rStyle w:val="VerbatimChar"/>
+              </w:rPr>
+              <w:t xml:space="preserve">$.intent = 'exchange_currency' is invalid</w:t>
+            </w:r>
+          </w:p>
+        </w:tc>
+      </w:tr>
+      <w:tr>
+        <w:tc>
+          <w:tcPr/>
+          <w:p>
+            <w:pPr>
+              <w:pStyle w:val="Compact"/>
+            </w:pPr>
+            <w:r>
+              <w:t xml:space="preserve">help me obtain a virtual card</w:t>
+            </w:r>
+          </w:p>
+        </w:tc>
+        <w:tc>
+          <w:tcPr/>
+          <w:p>
+            <w:pPr>
+              <w:pStyle w:val="Compact"/>
+            </w:pPr>
+            <w:r>
+              <w:rPr>
+                <w:rStyle w:val="VerbatimChar"/>
+              </w:rPr>
+              <w:t xml:space="preserve">{"intent": "get_virtual_card", "confidence": 0.95}</w:t>
+            </w:r>
+          </w:p>
+        </w:tc>
+        <w:tc>
+          <w:tcPr/>
+          <w:p>
+            <w:pPr>
+              <w:pStyle w:val="Compact"/>
+            </w:pPr>
+            <w:r>
+              <w:rPr>
+                <w:b/>
+                <w:bCs/>
+              </w:rPr>
+              <w:t xml:space="preserve">rejected</w:t>
+            </w:r>
+            <w:r>
+              <w:t xml:space="preserve">:</w:t>
+            </w:r>
+            <w:r>
+              <w:t xml:space="preserve"> </w:t>
+            </w:r>
+            <w:r>
+              <w:rPr>
+                <w:rStyle w:val="VerbatimChar"/>
+              </w:rPr>
+              <w:t xml:space="preserve">$.intent = 'get_virtual_card' is invalid</w:t>
+            </w:r>
+          </w:p>
+        </w:tc>
+      </w:tr>
+    </w:tbl>
+    <w:p>
+      <w:pPr>
+        <w:pStyle w:val="FirstParagraph"/>
+      </w:pPr>
+      <w:r>
+        <w:t xml:space="preserve">The two rejected names look plausible but are not in the 77-name list (the real labels are</w:t>
+      </w:r>
+      <w:r>
+        <w:t xml:space="preserve"> </w:t>
+      </w:r>
+      <w:r>
+        <w:rPr>
+          <w:rStyle w:val="VerbatimChar"/>
+        </w:rPr>
+        <w:t xml:space="preserve">exchange_via_app</w:t>
+      </w:r>
+      <w:r>
+        <w:t xml:space="preserve"> </w:t>
+      </w:r>
+      <w:r>
+        <w:t xml:space="preserve">and</w:t>
+      </w:r>
+      <w:r>
+        <w:t xml:space="preserve"> </w:t>
+      </w:r>
+      <w:r>
+        <w:rPr>
+          <w:rStyle w:val="VerbatimChar"/>
+        </w:rPr>
+        <w:t xml:space="preserve">getting_virtual_card</w:t>
+      </w:r>
+      <w:r>
+        <w:t xml:space="preserve">). A loose text parser would have accepted them; the enum turns them into a handled error, and the assistant asks the customer to rephrase. The</w:t>
+      </w:r>
+      <w:r>
+        <w:t xml:space="preserve"> </w:t>
+      </w:r>
+      <w:r>
+        <w:rPr>
+          <w:rStyle w:val="VerbatimChar"/>
+        </w:rPr>
+        <w:t xml:space="preserve">confidence</w:t>
+      </w:r>
+      <w:r>
+        <w:t xml:space="preserve"> </w:t>
+      </w:r>
+      <w:r>
+        <w:t xml:space="preserve">value is copied from the examples (0.9 or 0.95 on every row), which is why the field was dropped from the final system.</w:t>
       </w:r>
     </w:p>
     <w:p>

</xml_diff>